<commit_message>
docs: keep original cloud/HTTPS deployment narrative in capstone document; retain other sync fixes
</commit_message>
<xml_diff>
--- a/IMRAWS-NLP-CAPSTONE-DOCUMENT-MAINFOR-CHECKING-ONLY (1) - UPDATED.docx
+++ b/IMRAWS-NLP-CAPSTONE-DOCUMENT-MAINFOR-CHECKING-ONLY (1) - UPDATED.docx
@@ -4327,7 +4327,7 @@
           <w:sz w:val="24"/>
           <w:szCs w:val="24"/>
         </w:rPr>
-        <w:t>Notifications: Receives notifications in the mobile application whenever the status of a submitted complaint is updated.</w:t>
+        <w:t>Notifications: Receives push notifications whenever the status of a submitted complaint is updated.</w:t>
       </w:r>
     </w:p>
     <w:p>
@@ -10245,7 +10245,7 @@
           <w:sz w:val="24"/>
           <w:szCs w:val="24"/>
         </w:rPr>
-        <w:t>Process 3.4 (Filter by Availability) cross-references this list against D4 (Availability) and D2 (Incident) using the Incident ID to identify available personnel, producing a filtered list passed to Process 3.5 (Select Primary Team Leader). The selected Team Leader ID is forwarded to Process 3.6 (Create Assignment Record), which writes the assignment to D3 (Assignment) and triggers Process 3.7 (Update Incident Status to Assigned), which updates D2 (Incident) accordingly. Finally, Process 3.8 (Push to Team Leader Mobile Queue) records the assignment in the mobile app's incident queue and creates a notification entry for the Offsite Team Leader, completing the automated routing workflow.</w:t>
+        <w:t>Process 3.4 (Filter by Availability) cross-references this list against D4 (Availability) and D2 (Incident) using the Incident ID to identify available personnel, producing a filtered list passed to Process 3.5 (Select Primary Team Leader). The selected Team Leader ID is forwarded to Process 3.6 (Create Assignment Record), which writes the assignment to D3 (Assignment) and triggers Process 3.7 (Update Incident Status to Assigned), which updates D2 (Incident) accordingly. Finally, Process 3.8 (Push to Team Leader Mobile Queue) triggers a queue update that delivers the incident directly to the Offsite Team Leader's mobile application, completing the automated routing workflow.</w:t>
       </w:r>
     </w:p>
     <w:p>
@@ -10673,7 +10673,7 @@
           <w:szCs w:val="24"/>
         </w:rPr>
         <w:lastRenderedPageBreak/>
-        <w:t xml:space="preserve">The Level 2 DFD for Resolution Tracking illustrates the ten sub-processes through which the Offsite Staff manages and closes an assigned incident, culminating in a notification delivered to the Customer through the mobile app. The Offsite entity initiates the workflow by requesting their incident list, which is displayed through Process 5.1 (View Assigned Incidents List). This process reads assignment records from D3 (Assignments) by </w:t>
+        <w:t xml:space="preserve">The Level 2 DFD for Resolution Tracking illustrates the ten sub-processes through which the Offsite Staff manages and closes an assigned incident, culminating in a push notification delivered to the Customer. The Offsite entity initiates the workflow by requesting their incident list, which is displayed through Process 5.1 (View Assigned Incidents List). This process reads assignment records from D3 (Assignments) by </w:t>
       </w:r>
       <w:proofErr w:type="spellStart"/>
       <w:r>
@@ -10711,7 +10711,7 @@
           <w:sz w:val="24"/>
           <w:szCs w:val="24"/>
         </w:rPr>
-        <w:t xml:space="preserve">Process 5.4 (Perform Field Repair Work) represents the on-site resolution activity. Upon work completion, the Team Leader captures resolution notes through Process 5.5 (Capture Resolution Notes), with the option to submit photographic evidence through Process 5.6 (Attach Photo Proof – Optional). Process 5.7 (Update Status to 'Resolved') writes the resolved status to D2 (Incidents), after which Process 5.8 (Record Resolution Timestamp) sets the resolved_at field to the current timestamp and simultaneously updates the Assignment Record in D3 (Assignments). Process 5.9 (Generate Customer Notification) is then triggered, storing the notification record in D6 (Notifications) and alerting the Customer through the mobile app's notification center, completing the full resolution tracking cycle.</w:t>
+        <w:t xml:space="preserve">Process 5.4 (Perform Field Repair Work) represents the on-site resolution activity. Upon work completion, the Team Leader captures resolution notes through Process 5.5 (Capture Resolution Notes), with the option to submit photographic evidence through Process 5.6 (Attach Photo Proof – Optional). Process 5.7 (Update Status to 'Resolved') writes the resolved status to D2 (Incidents), after which Process 5.8 (Record Resolution Timestamp) sets the resolved_at field to the current timestamp and simultaneously updates the Assignment Record in D3 (Assignments). Process 5.9 (Generate Customer Notification) is then triggered, storing the notification record in D6 (Notifications) and passing the alert to Process 5.10 (Send Push Notification to Mobile Device), which delivers the Push Notification to the Customer, completing the full resolution tracking cycle.</w:t>
       </w:r>
       <w:proofErr w:type="spellStart"/>
       <w:r>
@@ -11551,7 +11551,7 @@
           <w:sz w:val="24"/>
           <w:szCs w:val="24"/>
         </w:rPr>
-        <w:t xml:space="preserve">The outputs of the system are tailored to the needs of four distinct stakeholder groups. Customers receive Real-Time Status Updates and Notifications, keeping them informed at every stage of their complaint's progress. Engineers are provided with an Incident Queue Dashboard for managing their assigned cases, a Flagged Incident Review and Adjudication Panel for handling escalated items, and Misclassification Trend Reports to identify recurring classification errors. Additionally, engineers receive comprehensive report analytics including dashboards, incident trend reports, staff performance reports, resolution summaries, and NLP correction reports for deeper system evaluation. Offsite Staff are given an Assigned Incidents List showing their current tasks, an Availability Toggle Interface to manage their status, a Resolution Notes and Status Update Module to document their work, and HITL Action Prompts to accept, reject, or correct AI-generated decisions. The system also ensures resolution tracking through resolution notes and status updates for proper documentation of incidents. Administrators receive the most comprehensive set of outputs, including User Account Management (CRUD) tools, Department and Routing Rule Configuration controls, System-Wide Performance Dashboards, and Feedback Logs for NLP Retraining to support continuous model improvement. </w:t>
+        <w:t xml:space="preserve">The outputs of the system are tailored to the needs of four distinct stakeholder groups. Customers receive Real-Time Status Updates and Push Notifications, keeping them informed at every stage of their complaint's progress. Engineers are provided with an Incident Queue Dashboard for managing their assigned cases, a Flagged Incident Review and Adjudication Panel for handling escalated items, and Misclassification Trend Reports to identify recurring classification errors. Additionally, engineers receive comprehensive report analytics including dashboards, incident trend reports, staff performance reports, resolution summaries, and NLP correction reports for deeper system evaluation. Offsite Staff are given an Assigned Incidents List showing their current tasks, an Availability Toggle Interface to manage their status, a Resolution Notes and Status Update Module to document their work, and HITL Action Prompts to accept, reject, or correct AI-generated decisions. The system also ensures resolution tracking through resolution notes and status updates for proper documentation of incidents. Administrators receive the most comprehensive set of outputs, including User Account Management (CRUD) tools, Department and Routing Rule Configuration controls, System-Wide Performance Dashboards, and Feedback Logs for NLP Retraining to support continuous model improvement. </w:t>
       </w:r>
       <w:r>
         <w:rPr>
@@ -12653,7 +12653,7 @@
           <w:sz w:val="24"/>
           <w:szCs w:val="24"/>
         </w:rPr>
-        <w:t xml:space="preserve"> presents the overall system architecture of IMRAWS-NLP. The system follows a modern client-server architecture in which customers, offsite team leaders, engineers, and administrators interact with the platform through a Android mobile frontend developed in Flutter and a web portal built on Laravel. The frontend communicates with a centralized backend API that processes natural language complaint data, executes classification and sentiment analysis through Python NLP libraries, and persists all records to a PostgreSQL database hosted on the local development server. A dedicated routing module handles the automated assignment of incidents to available team leaders, while a Human-in-the-Loop feedback mechanism logs corrections and adjudication decisions as feedback data to support NLP model improvement.</w:t>
+        <w:t xml:space="preserve"> presents the overall system architecture of IMRAWS-NLP. The system follows a modern client-server architecture in which customers, offsite team leaders, engineers, and administrators interact with the platform through a cross-platform mobile frontend developed in Flutter and a web portal built on Laravel. The frontend communicates with a centralized backend API that processes natural language complaint data, executes classification and sentiment analysis through Python NLP libraries, and persists all records to a PostgreSQL database hosted on Oracle Cloud. A dedicated routing module handles the automated assignment of incidents to available team leaders, while a Human-in-the-Loop feedback mechanism logs corrections and adjudication decisions as feedback data to support NLP model improvement.</w:t>
       </w:r>
     </w:p>
     <w:p>
@@ -12855,7 +12855,7 @@
           <w:szCs w:val="24"/>
         </w:rPr>
         <w:tab/>
-        <w:t>Smartphone and Tablet: Mobile devices running Android are the primary access point for Customers and Offsite Team Leaders, who interact with the system through the Flutter mobile application to submit complaints, manage incident queues, and track resolution progress.</w:t>
+        <w:t>Smartphone and Tablet: Mobile devices running Android or iOS are the primary access point for Customers and Offsite Team Leaders, who interact with the system through the Flutter mobile application to submit complaints, manage incident queues, and track resolution progress.</w:t>
       </w:r>
     </w:p>
     <w:p>
@@ -12890,7 +12890,7 @@
           <w:szCs w:val="24"/>
         </w:rPr>
         <w:tab/>
-        <w:t>Local Development Server: The local development PC constitutes the physical infrastructure of the system, hosting the PostgreSQL database, the Laravel backend API, and the Python NLP processing environment.</w:t>
+        <w:t>Oracle Cloud VPS: The Oracle Cloud Virtual Private Server constitutes the physical infrastructure backbone of the system, hosting the database, the backend API, and the Python NLP processing environment within a secured and managed cloud data center.</w:t>
       </w:r>
     </w:p>
     <w:p>
@@ -12978,7 +12978,7 @@
           <w:szCs w:val="24"/>
         </w:rPr>
         <w:tab/>
-        <w:t>Local Development Environment: During development and testing, the system runs on a local PC, hosting both the Laravel backend and the PostgreSQL database. The backend API is served over HTTP on the local network so that the Flutter mobile application installed on physical Android devices can reach it.</w:t>
+        <w:t>Oracle Cloud / Render VPS: The system is hosted on Oracle Cloud Virtual Private Server infrastructure, providing a secure, scalable, and managed cloud environment for both the Laravel backend and the PostgreSQL database. Render VPS is additionally utilized for backend service deployment, offering streamlined continuous deployment capabilities.</w:t>
       </w:r>
     </w:p>
     <w:p>
@@ -13013,7 +13013,7 @@
           <w:szCs w:val="24"/>
         </w:rPr>
         <w:tab/>
-        <w:t>HTTP and JWT Security: During development the backend is served over HTTP on the local network; in production HTTPS would be used to protect data in transit. JWT tokens are issued upon successful authentication and must accompany every subsequent API request to verify session legitimacy.</w:t>
+        <w:t>HTTPS and JWT Security: All data transmitted between the client applications and the backend server is encrypted through HTTPS, preventing interception or tampering during transit. JWT tokens are issued upon successful authentication and must accompany every subsequent API request to verify session legitimacy.</w:t>
       </w:r>
     </w:p>
     <w:p>
@@ -13048,7 +13048,7 @@
           <w:szCs w:val="24"/>
         </w:rPr>
         <w:tab/>
-        <w:t>Standalone Deployment: The Laravel API and the FastAPI NLP microservice are deployed as standalone processes on the local network during development, and can later be hosted on a cloud provider for production use.</w:t>
+        <w:t>Serverless Cloud Infrastructure: The system is deployed under a serverless architecture model, which eliminates the need to manage dedicated server instances and allows the backend to scale automatically in response to fluctuating incident volumes and user activity.</w:t>
       </w:r>
     </w:p>
     <w:p>
@@ -13100,7 +13100,7 @@
           <w:sz w:val="24"/>
           <w:szCs w:val="24"/>
         </w:rPr>
-        <w:t>This layer manages the persistent storage of all system data through a structured relational database built on PostgreSQL and hosted on the local development server.</w:t>
+        <w:t>This layer manages the persistent storage of all system data through a structured relational database built on PostgreSQL and hosted on Oracle Cloud.</w:t>
       </w:r>
     </w:p>
     <w:p>

</xml_diff>